<commit_message>
fix(db): make migrations replayable on empty database and refresh all docs
- add 000_schema_initial.sql (bootstrap business tables) and 013_otp_codes.sql;
  drop root create_otp_table.sql - full replay 000-013 now rebuilds all 14 tables
- align router counts everywhere: 16 mounted routers (14 files), 80 endpoints
- update migration counts to 13 across README, API README and report sources
- drop removed upload-etudiants feature from report generator, regenerate 6 PDFs
- refresh audit generator statuses/migration refs/25-column import, regenerate docx
- add .env.example for API and front, un-ignore it in .gitignore
- replace front boilerplate README, add favicon, pin vitest pool to threads
</commit_message>
<xml_diff>
--- a/Audit_Final_Alumni_CRM.docx
+++ b/Audit_Final_Alumni_CRM.docx
@@ -57,7 +57,7 @@
           <w:color w:val="555555"/>
           <w:sz w:val="24"/>
         </w:rPr>
-        <w:t>Date de l'audit : 19 août 2026</w:t>
+        <w:t>Date de l'audit : 24/08/2026 (mise a jour du document initial du 19/08/2026)</w:t>
         <w:br/>
         <w:t>Échéance soutenance : 19 septembre 2026</w:t>
       </w:r>
@@ -254,7 +254,7 @@
         <w:pStyle w:val="ListBullet"/>
       </w:pPr>
       <w:r>
-        <w:t>• Coordonnées : address, city, country, telephone, linkedin, email, email_academique, date_naissance — collectés à l'inscription (AlumniRegistration.jsx) et modifiables via le profil (AlumniProfile.jsx, AlumniProfileUpdate.jsx)</w:t>
+        <w:t>• Coordonnées : address, city, country, telephone, linkedin, email, email_academique, date_naissance — collectés à l'inscription (AlumniRegistration.jsx) et modifiables via le profil (AlumniProfile.jsx)</w:t>
       </w:r>
     </w:p>
     <w:p>
@@ -302,7 +302,7 @@
         <w:pStyle w:val="ListBullet"/>
       </w:pPr>
       <w:r>
-        <w:t>• Salaire : colonne salaire (numeric) dans EXPERIENCE_PRO — collecté dans AlumniCareer.jsx:121-122 et AlumniProfileUpdate.jsx:96-97, exposé dans le dashboard (admin.py:338-387)</w:t>
+        <w:t>• Salaire : colonnes salaire (numeric) et salary_annuel NUMERIC(10,2) (migration 012_salary_annuel.sql) dans EXPERIENCE_PRO — saisie via un select de tranches chiffrées SALARY_RANGES (AlumniCareer.jsx:9-22, select en AlumniCareer.jsx:151-156) converti en salary_annuel côté client (api.js:336-343), exploité par le dashboard (admin.py:145 calculer_indicateurs)</w:t>
       </w:r>
     </w:p>
     <w:p>
@@ -348,7 +348,7 @@
         <w:pStyle w:val="ListBullet"/>
       </w:pPr>
       <w:r>
-        <w:t>• Modifiable : UPSERT sur (id_etudiant, type_consentement) UNIQUE — migration 007_consentement_upsert.sql, endpoint rgpd.py:46</w:t>
+        <w:t>• Modifiable : UPSERT sur (id_etudiant, type_consentement) UNIQUE — migration 006_consentement_upsert.sql, endpoint rgpd.py:41</w:t>
       </w:r>
     </w:p>
     <w:p>
@@ -372,7 +372,7 @@
         <w:pStyle w:val="ListBullet"/>
       </w:pPr>
       <w:r>
-        <w:t>• Suppression fonctionnelle : Anonymisation différée (6 mois par défaut via PURGE_DELAY_MONTHS) avec date_anonymisation sur ETUDIANT, FK CASCADE sur REPONSE_QUESTIONNAIRE — migration 009_purge_anonymises.sql</w:t>
+        <w:t>• Suppression fonctionnelle : Anonymisation différée (6 mois par défaut via PURGE_DELAY_MONTHS) avec date_anonymisation sur ETUDIANT, FK CASCADE sur REPONSE_QUESTIONNAIRE — migration 008_purge_anonymises.sql</w:t>
       </w:r>
     </w:p>
     <w:p>
@@ -403,9 +403,9 @@
       <w:r>
         <w:rPr>
           <w:b/>
-          <w:color w:val="F39C12"/>
+          <w:color w:val="27AE60"/>
         </w:rPr>
-        <w:t>Statut : PARTIEL</w:t>
+        <w:t>Statut : FAIT</w:t>
       </w:r>
     </w:p>
     <w:p>
@@ -426,7 +426,7 @@
         <w:pStyle w:val="ListBullet"/>
       </w:pPr>
       <w:r>
-        <w:t>Tables : QUESTIONNAIRE, QUESTION, REPONSE_QUESTIONNAIRE — migration 004_questionnaire_annuel.sql</w:t>
+        <w:t>Tables : QUESTIONNAIRE, QUESTION, REPONSE_QUESTIONNAIRE — migration 003_questionnaire_annuel.sql</w:t>
       </w:r>
     </w:p>
     <w:p>
@@ -450,7 +450,7 @@
         <w:pStyle w:val="ListBullet"/>
       </w:pPr>
       <w:r>
-        <w:t>KPI via tag sur QUESTION (migration 005_question_tag.sql) et conditionnee_statut_emploi (migration 006)</w:t>
+        <w:t>KPI via tag sur QUESTION (migration 004_question_tag.sql) et conditionnee_statut_emploi (migration 005_question_statut_emploi.sql)</w:t>
       </w:r>
     </w:p>
     <w:p>
@@ -458,7 +458,7 @@
         <w:pStyle w:val="ListBullet"/>
       </w:pPr>
       <w:r>
-        <w:t>Indicateurs calculés dans admin.py:328-387 (taux d'emploi, salaire moyen, taux 6 mois, taux adéquation)</w:t>
+        <w:t>Indicateurs calculés dans admin.py (calculer_indicateurs, admin.py:145) : taux d'emploi, salaire moyen, taux 6 mois, taux adéquation</w:t>
       </w:r>
     </w:p>
     <w:p>
@@ -466,7 +466,7 @@
         <w:pStyle w:val="Heading3"/>
       </w:pPr>
       <w:r>
-        <w:t>Relance proactive — MANQUANT</w:t>
+        <w:t>Relance proactive — FAIT</w:t>
       </w:r>
     </w:p>
     <w:p>
@@ -474,7 +474,7 @@
         <w:rPr>
           <w:i/>
         </w:rPr>
-        <w:t>Il n'existe AUCUN mécanisme de relance automatique. L'alumni doit se connecter de sa propre initiative. La seule utilisation de l'API Resend (otp.py:76-88) est pour l'envoi de codes OTP d'authentification. Il n'y a aucun email de relance, aucune notification push, aucun cron job de sollicitation.</w:t>
+        <w:t>L'endpoint POST /admin/questionnaires/notififier (questionnaires.py:456) envoie une notification email aux alumni n'ayant pas encore répondu au questionnaire actif, avec filtre optionnel par promotion. L'envoi passe par Resend (comme les OTP), le corps du message est générique et ne contient pas encore de lien direct vers le formulaire.</w:t>
       </w:r>
     </w:p>
     <w:p>
@@ -482,7 +482,7 @@
         <w:pStyle w:val="ListBullet"/>
       </w:pPr>
       <w:r>
-        <w:t>Ce qu'il faudrait ajouter :</w:t>
+        <w:t>Reste à faire (non bloquant, suites à donner au projet) :</w:t>
       </w:r>
     </w:p>
     <w:p>
@@ -490,7 +490,7 @@
         <w:pStyle w:val="ListBullet2"/>
       </w:pPr>
       <w:r>
-        <w:t>Un endpoint/scheduler (ex : cron hebdomadaire) identifiant les alumni sans réponse au questionnaire actif</w:t>
+        <w:t>Un déclenchement automatique planifié (cron hebdomadaire) en plus de l'appel manuel de l'endpoint</w:t>
       </w:r>
     </w:p>
     <w:p>
@@ -498,7 +498,7 @@
         <w:pStyle w:val="ListBullet2"/>
       </w:pPr>
       <w:r>
-        <w:t>Des emails de relance automatisés via Resend (clé API déjà configurée dans .env et config.py:10-11)</w:t>
+        <w:t>Une interface admin dédiée au déclenchement de la relance (aujourd'hui appel API uniquement)</w:t>
       </w:r>
     </w:p>
     <w:p>
@@ -620,7 +620,7 @@
               <w:rPr>
                 <w:sz w:val="20"/>
               </w:rPr>
-              <w:t>admin.py:164</w:t>
+              <w:t>admin.py:145 (calculer_indicateurs)</w:t>
             </w:r>
           </w:p>
         </w:tc>
@@ -633,7 +633,7 @@
               <w:rPr>
                 <w:sz w:val="20"/>
               </w:rPr>
-              <w:t>Hero card AdminDashboard.jsx:995</w:t>
+              <w:t>Hero card AdminDashboard.jsx:92</w:t>
             </w:r>
           </w:p>
         </w:tc>
@@ -661,7 +661,7 @@
               <w:rPr>
                 <w:sz w:val="20"/>
               </w:rPr>
-              <w:t>admin.py (taux_6_mois)</w:t>
+              <w:t>admin.py:145 (calculer_indicateurs)</w:t>
             </w:r>
           </w:p>
         </w:tc>
@@ -702,7 +702,7 @@
               <w:rPr>
                 <w:sz w:val="20"/>
               </w:rPr>
-              <w:t>admin.py (taux_adquation)</w:t>
+              <w:t>admin.py:692 (/indicateurs/kpi-tag)</w:t>
             </w:r>
           </w:p>
         </w:tc>
@@ -743,7 +743,7 @@
               <w:rPr>
                 <w:sz w:val="20"/>
               </w:rPr>
-              <w:t>admin.py:338-387</w:t>
+              <w:t>admin.py:145 (calculer_indicateurs)</w:t>
             </w:r>
           </w:p>
         </w:tc>
@@ -756,7 +756,7 @@
               <w:rPr>
                 <w:sz w:val="20"/>
               </w:rPr>
-              <w:t>Jauge demi-cercle dynamique AdminDashboard.jsx:1198-1215</w:t>
+              <w:t>Jauge demi-cercle dynamique AdminDashboard.jsx</w:t>
             </w:r>
           </w:p>
         </w:tc>
@@ -784,7 +784,7 @@
               <w:rPr>
                 <w:sz w:val="20"/>
               </w:rPr>
-              <w:t>admin.py (taux_recommandation)</w:t>
+              <w:t>admin.py (calculer_indicateurs)</w:t>
             </w:r>
           </w:p>
         </w:tc>
@@ -825,7 +825,7 @@
               <w:rPr>
                 <w:sz w:val="20"/>
               </w:rPr>
-              <w:t>admin.py (repartition_secteur)</w:t>
+              <w:t>admin.py:402 (/indicateurs/secteurs)</w:t>
             </w:r>
           </w:p>
         </w:tc>
@@ -866,7 +866,7 @@
               <w:rPr>
                 <w:sz w:val="20"/>
               </w:rPr>
-              <w:t>admin.py (evolution_promotions)</w:t>
+              <w:t>admin.py (calculer_indicateurs)</w:t>
             </w:r>
           </w:p>
         </w:tc>
@@ -907,7 +907,7 @@
               <w:rPr>
                 <w:sz w:val="20"/>
               </w:rPr>
-              <w:t>admin.py (taux_completion)</w:t>
+              <w:t>admin.py (calculer_indicateurs)</w:t>
             </w:r>
           </w:p>
         </w:tc>
@@ -948,7 +948,7 @@
               <w:rPr>
                 <w:sz w:val="20"/>
               </w:rPr>
-              <w:t>intégré</w:t>
+              <w:t>admin.py:452 (/indicateurs/types-contrat)</w:t>
             </w:r>
           </w:p>
         </w:tc>
@@ -1039,9 +1039,9 @@
       <w:r>
         <w:rPr>
           <w:b/>
-          <w:color w:val="F39C12"/>
+          <w:color w:val="27AE60"/>
         </w:rPr>
-        <w:t>Statut : PARTIEL</w:t>
+        <w:t>Statut : FAIT</w:t>
       </w:r>
     </w:p>
     <w:p>
@@ -1166,7 +1166,7 @@
               <w:rPr>
                 <w:sz w:val="20"/>
               </w:rPr>
-              <w:t>148 lignes, 14 tables</w:t>
+              <w:t>155 lignes, 14 tables</w:t>
             </w:r>
           </w:p>
         </w:tc>
@@ -1184,7 +1184,7 @@
                 <w:color w:val="000000"/>
                 <w:sz w:val="20"/>
               </w:rPr>
-              <w:t>COMPLET et à jour (10/08/2026, vérifié 15/08/2026)</w:t>
+              <w:t>COMPLET et à jour (10/08/2026, vérifié 15/08 et 22/08/2026)</w:t>
             </w:r>
           </w:p>
         </w:tc>
@@ -1271,7 +1271,7 @@
               <w:rPr>
                 <w:sz w:val="20"/>
               </w:rPr>
-              <w:t>MCD_MLD V2.loo + MCD_MLD.loo + .lo1</w:t>
+              <w:t>000_schema_initial.sql + migrations 001-013</w:t>
             </w:r>
           </w:p>
         </w:tc>
@@ -1284,7 +1284,7 @@
               <w:rPr>
                 <w:sz w:val="20"/>
               </w:rPr>
-              <w:t>Binaires</w:t>
+              <w:t>14 fichiers SQL</w:t>
             </w:r>
           </w:p>
         </w:tc>
@@ -1302,7 +1302,7 @@
                 <w:color w:val="000000"/>
                 <w:sz w:val="20"/>
               </w:rPr>
-              <w:t>Phase initiale Looping (28/07/2026), supplanté par Mermaid</w:t>
+              <w:t>Rejeu complet validé sur base vide : les 14 tables sont recréées (24/08/2026)</w:t>
             </w:r>
           </w:p>
         </w:tc>
@@ -1315,7 +1315,7 @@
               <w:rPr>
                 <w:sz w:val="20"/>
               </w:rPr>
-              <w:t>Obsolète</w:t>
+              <w:t>FAIT</w:t>
             </w:r>
           </w:p>
         </w:tc>
@@ -1330,7 +1330,7 @@
               <w:rPr>
                 <w:sz w:val="20"/>
               </w:rPr>
-              <w:t>mcd_corrige.md</w:t>
+              <w:t>MCD_MLD V2.loo</w:t>
             </w:r>
           </w:p>
         </w:tc>
@@ -1343,7 +1343,7 @@
               <w:rPr>
                 <w:sz w:val="20"/>
               </w:rPr>
-              <w:t>102 lignes, 11 tables</w:t>
+              <w:t>Binaire Looping</w:t>
             </w:r>
           </w:p>
         </w:tc>
@@ -1361,7 +1361,7 @@
                 <w:color w:val="000000"/>
                 <w:sz w:val="20"/>
               </w:rPr>
-              <w:t>OBSOLÈTE — manque DEMANDE_RGPD, OTP_CODES, SCHEMA_MIGRATIONS</w:t>
+              <w:t>Phase initiale de conception (28/07/2026), supplanté par Mermaid ; les autres fichiers Looping (.loo/.lo1 doublons) ont été supprimés</w:t>
             </w:r>
           </w:p>
         </w:tc>
@@ -1374,7 +1374,7 @@
               <w:rPr>
                 <w:sz w:val="20"/>
               </w:rPr>
-              <w:t>À corriger</w:t>
+              <w:t>Source historique</w:t>
             </w:r>
           </w:p>
         </w:tc>
@@ -1392,19 +1392,6 @@
     <w:p>
       <w:r>
         <w:t>CONFIRMÉE — erd_alumni_crm.mmd:18 : ETUDIANT ||--o{ EXPERIENCE_PRO (0,n expériences par étudiant). Historique de carrière multiple, pas un seul poste.</w:t>
-      </w:r>
-    </w:p>
-    <w:p>
-      <w:pPr>
-        <w:pStyle w:val="Heading3"/>
-      </w:pPr>
-      <w:r>
-        <w:t>Ce qu'il faut corriger</w:t>
-      </w:r>
-    </w:p>
-    <w:p>
-      <w:r>
-        <w:t>Synchroniser ou supprimer mcd_corrige.md (alumni_crm_front/) pour qu'il reflète le schéma réel (14 tables).</w:t>
       </w:r>
     </w:p>
     <w:p>
@@ -1434,7 +1421,7 @@
     </w:p>
     <w:p>
       <w:r>
-        <w:t>CONFIRMÉ — AlumniDirectory.jsx (719 lignes) : filtres AND-combinés dans un useMemo (l.72-114) :</w:t>
+        <w:t>CONFIRMÉ — AlumniDirectory.jsx (686 lignes) : filtres AND-combinés dans un useMemo (l.72-114) :</w:t>
       </w:r>
     </w:p>
     <w:p>
@@ -1487,7 +1474,7 @@
     </w:p>
     <w:p>
       <w:r>
-        <w:t>CONFIRMÉ — AdminDashboard.jsx (1266 lignes) : hero cards, jauge salaire dynamique, donuts, bar charts, timeline cohortes, KPI tags depuis questionnaires.</w:t>
+        <w:t>CONFIRMÉ — AdminDashboard.jsx (1208 lignes) : hero cards, jauge salaire dynamique, donuts, bar charts, timeline cohortes, KPI tags depuis questionnaires.</w:t>
       </w:r>
     </w:p>
     <w:p>
@@ -1512,7 +1499,7 @@
         <w:pStyle w:val="ListBullet"/>
       </w:pPr>
       <w:r>
-        <w:t>• Formulaire d'inscription INITIAL distinct : CONFIRMÉ — AlumniRegistration.jsx (632 lignes) : wizard multi-étapes (4 étapes), distinct de la mise à jour. Stocke alumni_id en localStorage après succès.</w:t>
+        <w:t>• Formulaire d'inscription INITIAL distinct : CONFIRMÉ — AlumniRegistration.jsx (601 lignes) : wizard multi-étapes (4 étapes), distinct de la mise à jour. Stocke alumni_id en localStorage après succès.</w:t>
       </w:r>
     </w:p>
     <w:p>
@@ -1520,7 +1507,7 @@
         <w:pStyle w:val="ListBullet"/>
       </w:pPr>
       <w:r>
-        <w:t>• Mise à jour du profil professionnel : CONFIRMÉE — AlumniProfileUpdate.jsx (425 lignes) : profil + carrière + certifications. AlumniCareer.jsx (674 lignes) : CRUD expériences avec modals de confirmation.</w:t>
+        <w:t>• Mise à jour du profil professionnel : CONFIRMÉE — AlumniProfile.jsx : consultation et mise à jour du profil ; AlumniCareer.jsx (671 lignes) : CRUD expériences + certifications avec modals de confirmation. Limite assumée : pas de modification in place d'une expérience existante (ajout/suppression uniquement).</w:t>
       </w:r>
     </w:p>
     <w:p>
@@ -1528,7 +1515,7 @@
         <w:pStyle w:val="ListBullet"/>
       </w:pPr>
       <w:r>
-        <w:t>• Suppression d'une entrée par erreur : CONFIRMÉE — AlumniCareer.jsx:318-333 : bouton "Supprimer" + modal de confirmation. confirmRemove() (l.370) appelle careerAPI.delete() côté serveur. Bloqué sur comptes anonymisés (l.324-326).</w:t>
+        <w:t>• Suppression d'une entrée par erreur : CONFIRMÉE — AlumniCareer.jsx : bouton "Supprimer" + modal de confirmation. confirmRemove() (l.403) appelle careerAPI.delete() côté serveur. Bloqué sur comptes anonymisés.</w:t>
       </w:r>
     </w:p>
     <w:p>
@@ -1558,7 +1545,7 @@
         <w:pStyle w:val="ListBullet"/>
       </w:pPr>
       <w:r>
-        <w:t>import_export.py:135-266 : POST /import/excel — accepte .xlsx, .xls, .csv</w:t>
+        <w:t>import_export.py:186 : POST /import/excel — accepte .xlsx, .xls, .csv</w:t>
       </w:r>
     </w:p>
     <w:p>
@@ -1566,7 +1553,7 @@
         <w:pStyle w:val="ListBullet"/>
       </w:pPr>
       <w:r>
-        <w:t>21 colonnes supportées (l.27-51) : prénom, nom, email, téléphone, promotion, entreprise, poste, secteur, salaire, etc.</w:t>
+        <w:t>25 colonnes supportées (COLUMN_MAP, import_export.py:28) : prénom, nom, email, téléphone, promotion, entreprise, poste, secteur, salaire, etc.</w:t>
       </w:r>
     </w:p>
     <w:p>
@@ -1582,7 +1569,7 @@
         <w:pStyle w:val="ListBullet"/>
       </w:pPr>
       <w:r>
-        <w:t>Template de téléchargement (GET /import/template)</w:t>
+        <w:t>Template de téléchargement (GET /import/template, import_export.py:350)</w:t>
       </w:r>
     </w:p>
     <w:p>
@@ -1590,15 +1577,7 @@
         <w:pStyle w:val="ListBullet"/>
       </w:pPr>
       <w:r>
-        <w:t>Frontend : ExcelImport.jsx (387 lignes) — drag &amp; drop, preview 10 lignes, reconnaissance de colonnes</w:t>
-      </w:r>
-    </w:p>
-    <w:p>
-      <w:pPr>
-        <w:pStyle w:val="ListBullet"/>
-      </w:pPr>
-      <w:r>
-        <w:t>Deuxième endpoint : automatisation.py:20-154 — POST /upload-etudiants/ via pandas + Pydantic</w:t>
+        <w:t>Frontend : ExcelImport.jsx (366 lignes) — drag &amp; drop, preview 10 lignes, reconnaissance de colonnes</w:t>
       </w:r>
     </w:p>
     <w:p/>
@@ -1612,7 +1591,7 @@
         <w:pStyle w:val="ListBullet"/>
       </w:pPr>
       <w:r>
-        <w:t>GET /import/export/alumni (import_export.py:304) — génère .xlsx</w:t>
+        <w:t>GET /import/export/alumni (import_export.py:383) — génère .xlsx</w:t>
       </w:r>
     </w:p>
     <w:p>
@@ -1648,14 +1627,14 @@
       <w:r>
         <w:rPr>
           <w:b/>
-          <w:color w:val="E74C3C"/>
+          <w:color w:val="27AE60"/>
         </w:rPr>
-        <w:t>Statut : MANQUANT</w:t>
+        <w:t>Statut : FAIT</w:t>
       </w:r>
     </w:p>
     <w:p>
       <w:r>
-        <w:t>Aucun brouillon de rapport de stage n'existe dans le projet.</w:t>
+        <w:t>Le rapport de stage existe : source Markdown (Rapport/rapport.md) et PDF généré par script (Rapport/generate_reports.py).</w:t>
       </w:r>
     </w:p>
     <w:p>
@@ -1663,7 +1642,7 @@
         <w:pStyle w:val="ListBullet"/>
       </w:pPr>
       <w:r>
-        <w:t>generer_rapport.py (594 lignes) génère un document de préparation à l'oral (Preparation_Oral_Stage_CRM_Alumni.docx), PAS un rapport de stage</w:t>
+        <w:t>Structure complète : résumé/abstract, contexte IONIS-STM, missions, bilan de compétences, difficultés/solutions, bibliographie, annexes</w:t>
       </w:r>
     </w:p>
     <w:p>
@@ -1671,7 +1650,7 @@
         <w:pStyle w:val="ListBullet"/>
       </w:pPr>
       <w:r>
-        <w:t>Les 4 PDFs dans Rapport/ sont des livrables thématiques (cartographie, RGPD, stratégie, indicateurs), pas un rapport de stage structuré</w:t>
+        <w:t>Couvre les 5 domaines de mission du sujet (modélisation, backend, frontend, RGPD, indicateurs)</w:t>
       </w:r>
     </w:p>
     <w:p>
@@ -1679,7 +1658,7 @@
         <w:pStyle w:val="ListBullet"/>
       </w:pPr>
       <w:r>
-        <w:t>Aucun fichier contenant une introduction, conclusion, bibliographie, ou plan de rapport</w:t>
+        <w:t>Quelques compléments rédactionnels restent à porter par l'auteur (tuteur, dates, captures des annexes)</w:t>
       </w:r>
     </w:p>
     <w:p>
@@ -1704,7 +1683,7 @@
         <w:pStyle w:val="ListBullet"/>
       </w:pPr>
       <w:r>
-        <w:t>• Fichier principal : alumni_crm_api/docs/erd_alumni_crm.mmd — 14 tables, à jour au 15/08/2026</w:t>
+        <w:t>• Fichier principal : alumni_crm_api/docs/erd_alumni_crm.mmd — 14 tables, à jour au 22/08/2026</w:t>
       </w:r>
     </w:p>
     <w:p>
@@ -1720,7 +1699,7 @@
         <w:pStyle w:val="ListBullet"/>
       </w:pPr>
       <w:r>
-        <w:t>• Fichiers Looping : MCD_MLD V2.loo (28/07/2026) — phase initiale, supplanté par Mermaid</w:t>
+        <w:t>• Fichier Looping : MCD_MLD V2.loo (28/07/2026) — phase initiale, supplanté par Mermaid</w:t>
       </w:r>
     </w:p>
     <w:p>
@@ -1728,7 +1707,7 @@
         <w:pStyle w:val="ListBullet"/>
       </w:pPr>
       <w:r>
-        <w:t>• Note : mcd_corrige.md dans alumni_crm_front/ est obsolète (manque 3 tables)</w:t>
+        <w:t>• Rejeu base vide : 000_schema_initial.sql + 013_otp_codes.sql : les migrations reconstruisent intégralement le schéma (validé 24/08/2026)</w:t>
       </w:r>
     </w:p>
     <w:p>
@@ -1753,7 +1732,7 @@
         <w:pStyle w:val="ListBullet"/>
       </w:pPr>
       <w:r>
-        <w:t>Backend FastAPI opérationnel (14 routers, 50+ endpoints, Swagger à /docs)</w:t>
+        <w:t>Backend FastAPI opérationnel (16 routeurs montés, 80 endpoints)</w:t>
       </w:r>
     </w:p>
     <w:p>
@@ -1769,7 +1748,7 @@
         <w:pStyle w:val="ListBullet"/>
       </w:pPr>
       <w:r>
-        <w:t>Base PostgreSQL (14 tables, 12 migrations)</w:t>
+        <w:t>Base PostgreSQL (14 tables, 13 migrations)</w:t>
       </w:r>
     </w:p>
     <w:p>
@@ -1785,7 +1764,7 @@
         <w:pStyle w:val="ListBullet"/>
       </w:pPr>
       <w:r>
-        <w:t>Tests : 13 fichiers Vitest frontend, 66 assertions</w:t>
+        <w:t>Tests : 14 fichiers Vitest frontend, 117 tests</w:t>
       </w:r>
     </w:p>
     <w:p>
@@ -1808,19 +1787,14 @@
       <w:r>
         <w:rPr>
           <w:b/>
-          <w:color w:val="F39C12"/>
+          <w:color w:val="27AE60"/>
         </w:rPr>
-        <w:t>Statut : PARTIEL</w:t>
+        <w:t>Statut : FAIT</w:t>
       </w:r>
     </w:p>
     <w:p>
       <w:r>
-        <w:t>Pas de guide standalone dédié au service des relations entreprises.</w:t>
-      </w:r>
-    </w:p>
-    <w:p>
-      <w:r>
-        <w:t>Contenu partiel dans "Stratégie de Mise à Jour des Données - Alumni CRM.pdf" (Section 4, ~3 pages) couvrant :</w:t>
+        <w:t>Guide standalone dédié au service des relations entreprises, généré par script : "Guide des Processus - Animation du Reseau Alumni.pdf" (Rapport/generate_reports.py).</w:t>
       </w:r>
     </w:p>
     <w:p>
@@ -1828,7 +1802,7 @@
         <w:pStyle w:val="ListBullet"/>
       </w:pPr>
       <w:r>
-        <w:t>Pilotage des campagnes de questionnaire</w:t>
+        <w:t>Pilotage des campagnes de questionnaire (création, relances via POST /admin/questionnaires/notififier)</w:t>
       </w:r>
     </w:p>
     <w:p>
@@ -1844,12 +1818,7 @@
         <w:pStyle w:val="ListBullet"/>
       </w:pPr>
       <w:r>
-        <w:t>Newsletter (levier d'animation, ciblage par consentement)</w:t>
-      </w:r>
-    </w:p>
-    <w:p>
-      <w:r>
-        <w:t>Il manque un document dédié et complet avec : processus opérationnels, rôles, fréquence des actions, templates de communication.</w:t>
+        <w:t>Newsletter (levier d'animation, ciblage par consentement via POST /newsletter/envoyer)</w:t>
       </w:r>
     </w:p>
     <w:p>
@@ -2069,7 +2038,7 @@
               <w:rPr>
                 <w:sz w:val="20"/>
               </w:rPr>
-              <w:t>rgpd.py, demandes_rgpd.py, purge.py, AlumniConsent.jsx, AdminRgpdDemandes.jsx, migrations 007-010</w:t>
+              <w:t>rgpd.py, demandes_rgpd.py, purge.py, AlumniConsent.jsx, AdminRgpdDemandes.jsx, migrations 006-010</w:t>
             </w:r>
           </w:p>
         </w:tc>
@@ -2112,10 +2081,10 @@
             <w:r>
               <w:rPr>
                 <w:b/>
-                <w:color w:val="F39C12"/>
+                <w:color w:val="27AE60"/>
                 <w:sz w:val="20"/>
               </w:rPr>
-              <w:t>PARTIEL</w:t>
+              <w:t>FAIT</w:t>
             </w:r>
           </w:p>
         </w:tc>
@@ -2128,7 +2097,7 @@
               <w:rPr>
                 <w:sz w:val="20"/>
               </w:rPr>
-              <w:t>questionnaires.py, AdminQuestionnaires.jsx, AlumniSurvey.jsx — MANQUANT : relance proactive</w:t>
+              <w:t>questionnaires.py (relance : POST /admin/questionnaires/notififier), AdminQuestionnaires.jsx, AlumniSurvey.jsx — restent cron + UI dédiée (non bloquant)</w:t>
             </w:r>
           </w:p>
         </w:tc>
@@ -2187,7 +2156,7 @@
               <w:rPr>
                 <w:sz w:val="20"/>
               </w:rPr>
-              <w:t>admin.py:164,338-387, AdminDashboard.jsx:935-1263</w:t>
+              <w:t>admin.py:145+ (/indicateurs...), AdminDashboard.jsx</w:t>
             </w:r>
           </w:p>
         </w:tc>
@@ -2230,10 +2199,10 @@
             <w:r>
               <w:rPr>
                 <w:b/>
-                <w:color w:val="F39C12"/>
+                <w:color w:val="27AE60"/>
                 <w:sz w:val="20"/>
               </w:rPr>
-              <w:t>PARTIEL</w:t>
+              <w:t>FAIT</w:t>
             </w:r>
           </w:p>
         </w:tc>
@@ -2246,7 +2215,7 @@
               <w:rPr>
                 <w:sz w:val="20"/>
               </w:rPr>
-              <w:t>erd_alumni_crm.mmd (OK), mcd_corrige.md (obsolète)</w:t>
+              <w:t>erd_alumni_crm.mmd (14 tables) ; mcd_corrige.md supprimé</w:t>
             </w:r>
           </w:p>
         </w:tc>
@@ -2364,7 +2333,7 @@
               <w:rPr>
                 <w:sz w:val="20"/>
               </w:rPr>
-              <w:t>AlumniRegistration.jsx, AlumniProfileUpdate.jsx, AlumniCareer.jsx:318-370</w:t>
+              <w:t>AlumniRegistration.jsx, AlumniProfile.jsx, AlumniCareer.jsx</w:t>
             </w:r>
           </w:p>
         </w:tc>
@@ -2423,7 +2392,7 @@
               <w:rPr>
                 <w:sz w:val="20"/>
               </w:rPr>
-              <w:t>import_export.py:135-266, automatisation.py:20-154, ExcelImport.jsx</w:t>
+              <w:t>import_export.py (COLUMN_MAP 25 colonnes), ExcelImport.jsx</w:t>
             </w:r>
           </w:p>
         </w:tc>
@@ -2466,10 +2435,10 @@
             <w:r>
               <w:rPr>
                 <w:b/>
-                <w:color w:val="E74C3C"/>
+                <w:color w:val="27AE60"/>
                 <w:sz w:val="20"/>
               </w:rPr>
-              <w:t>MANQUANT</w:t>
+              <w:t>FAIT</w:t>
             </w:r>
           </w:p>
         </w:tc>
@@ -2482,7 +2451,7 @@
               <w:rPr>
                 <w:sz w:val="20"/>
               </w:rPr>
-              <w:t>Aucun fichier</w:t>
+              <w:t>Rapport/rapport.md + Rapport de Stage - Alumni CRM.pdf (compléments rédactionnels en cours)</w:t>
             </w:r>
           </w:p>
         </w:tc>
@@ -2541,7 +2510,7 @@
               <w:rPr>
                 <w:sz w:val="20"/>
               </w:rPr>
-              <w:t>erd_alumni_crm.mmd, erd_alumni_crm.docx (réserve : mcd_corrige.md obsolète)</w:t>
+              <w:t>erd_alumni_crm.mmd, erd_alumni_crm.docx, MCD_MLD V2.loo</w:t>
             </w:r>
           </w:p>
         </w:tc>
@@ -2600,7 +2569,7 @@
               <w:rPr>
                 <w:sz w:val="20"/>
               </w:rPr>
-              <w:t>dist/, requirements.txt, 14 routers, 13 fichiers test</w:t>
+              <w:t>dist/, requirements.txt, 16 routeurs montés (14 fichiers), 80 endpoints, 14 fichiers de tests (117 tests)</w:t>
             </w:r>
           </w:p>
         </w:tc>
@@ -2643,10 +2612,10 @@
             <w:r>
               <w:rPr>
                 <w:b/>
-                <w:color w:val="F39C12"/>
+                <w:color w:val="27AE60"/>
                 <w:sz w:val="20"/>
               </w:rPr>
-              <w:t>PARTIEL</w:t>
+              <w:t>FAIT</w:t>
             </w:r>
           </w:p>
         </w:tc>
@@ -2659,7 +2628,7 @@
               <w:rPr>
                 <w:sz w:val="20"/>
               </w:rPr>
-              <w:t>Section 4 du PDF Stratégie de Mise à Jour — pas de guide standalone</w:t>
+              <w:t>Guide des Processus - Animation du Reseau Alumni.pdf (standalone)</w:t>
             </w:r>
           </w:p>
         </w:tc>
@@ -2833,7 +2802,7 @@
               <w:rPr>
                 <w:sz w:val="20"/>
               </w:rPr>
-              <w:t>Aucun brouillon n'existe. C'est le livrable le plus important.</w:t>
+              <w:t>FAIT depuis la version initiale de l'audit : Rapport/rapport.md + PDF généré.</w:t>
             </w:r>
           </w:p>
         </w:tc>
@@ -2846,7 +2815,7 @@
               <w:rPr>
                 <w:sz w:val="20"/>
               </w:rPr>
-              <w:t>2-3 semaines</w:t>
+              <w:t>—</w:t>
             </w:r>
           </w:p>
         </w:tc>
@@ -2859,7 +2828,7 @@
               <w:rPr>
                 <w:sz w:val="20"/>
               </w:rPr>
-              <w:t>Introduction/contexte, missions, analyse conception (MCD/MLD, architecture), réalisation technique, résultats/indicateurs, conclusion/limites, bibliographie</w:t>
+              <w:t>Restent les compléments rédactionnels portés par l'auteur (tuteur, dates, captures des annexes)</w:t>
             </w:r>
           </w:p>
         </w:tc>
@@ -2900,7 +2869,7 @@
               <w:rPr>
                 <w:sz w:val="20"/>
               </w:rPr>
-              <w:t>Document dédié au service des relations entreprises.</w:t>
+              <w:t>FAIT depuis la version initiale de l'audit : Guide des Processus - Animation du Reseau Alumni.pdf.</w:t>
             </w:r>
           </w:p>
         </w:tc>
@@ -2913,7 +2882,7 @@
               <w:rPr>
                 <w:sz w:val="20"/>
               </w:rPr>
-              <w:t>2-3 jours</w:t>
+              <w:t>—</w:t>
             </w:r>
           </w:p>
         </w:tc>
@@ -2926,7 +2895,7 @@
               <w:rPr>
                 <w:sz w:val="20"/>
               </w:rPr>
-              <w:t>Processus opérationnels, rôles/responsabilités, fréquence des actions (campagnes questionnaire, relances, newsletter), templates de communication. Le contenu de la Section 4 du PDF Stratégie peut servir de base</w:t>
+              <w:t>Document standalone généré par Rapport/generate_reports.py</w:t>
             </w:r>
           </w:p>
         </w:tc>
@@ -3075,7 +3044,7 @@
               <w:rPr>
                 <w:sz w:val="20"/>
               </w:rPr>
-              <w:t>Implémenter la relance proactive</w:t>
+              <w:t>Compléter la relance proactive</w:t>
             </w:r>
           </w:p>
         </w:tc>
@@ -3088,7 +3057,7 @@
               <w:rPr>
                 <w:sz w:val="20"/>
               </w:rPr>
-              <w:t>Le questionnaire annuel fonctionne mais personne n'est sollicité.</w:t>
+              <w:t>PARTIELLEMENT FAIT : POST /admin/questionnaires/notififier envoie déjà les relances email aux non-répondants (filtre promotion).</w:t>
             </w:r>
           </w:p>
         </w:tc>
@@ -3114,7 +3083,7 @@
               <w:rPr>
                 <w:sz w:val="20"/>
               </w:rPr>
-              <w:t>Endpoint/cron identifiant les alumni sans réponse + emails de relance via Resend (clé API déjà configurée dans .env) + 2-3 relances espacées</w:t>
+              <w:t>Reste : déclenchement planifié (cron hebdomadaire), interface admin dédiée au déclenchement, 2-3 relances espacées + flag "injoignable"</w:t>
             </w:r>
           </w:p>
         </w:tc>
@@ -3155,7 +3124,7 @@
               <w:rPr>
                 <w:sz w:val="20"/>
               </w:rPr>
-              <w:t>Le fichier dans alumni_crm_front/ affiche 11 tables au lieu de 14.</w:t>
+              <w:t>FAIT : le fichier obsolète a été supprimé du dépôt ; erd_alumni_crm.mmd fait foi (14 tables).</w:t>
             </w:r>
           </w:p>
         </w:tc>
@@ -3168,7 +3137,7 @@
               <w:rPr>
                 <w:sz w:val="20"/>
               </w:rPr>
-              <w:t>30 min</w:t>
+              <w:t>—</w:t>
             </w:r>
           </w:p>
         </w:tc>
@@ -3181,7 +3150,7 @@
               <w:rPr>
                 <w:sz w:val="20"/>
               </w:rPr>
-              <w:t>Copier depuis erd_alumni_crm.mmd ou supprimer pour éviter la confusion</w:t>
+              <w:t>Rien à faire</w:t>
             </w:r>
           </w:p>
         </w:tc>
@@ -3201,7 +3170,7 @@
         <w:pStyle w:val="ListBullet"/>
       </w:pPr>
       <w:r>
-        <w:t>Migration 003 absente (numérotation sautée de 002 à 004) — cosmétique, ne bloque rien</w:t>
+        <w:t>Rejouabilité base vide rétablie (24/08/2026) : migration 000_schema_initial.sql (bootstrap des tables métier) + 013_otp_codes.sql (table OTP, anciennement créée hors migrations) — rejeu complet 000→013 validé sur base vide, 14/14 tables recréées</w:t>
       </w:r>
     </w:p>
     <w:p>
@@ -3209,7 +3178,7 @@
         <w:pStyle w:val="ListBullet"/>
       </w:pPr>
       <w:r>
-        <w:t>AlumniProfileUpdate.jsx:417 empêche la suppression de la dernière expérience — à documenter comme choix UX</w:t>
+        <w:t>Les fichiers Looping obsolètes (MCD_MLD.loo, MCD_MLD.lo1) ont été supprimés — seul MCD_MLD V2.loo est conservé comme source</w:t>
       </w:r>
     </w:p>
     <w:p>
@@ -3217,7 +3186,7 @@
         <w:pStyle w:val="ListBullet"/>
       </w:pPr>
       <w:r>
-        <w:t>Les fichiers .loo/.lo1 de Looping (juillet 2026) sont obsolètes — à nettoyer ou archiver</w:t>
+        <w:t>Suites techniques documentées dans le README API : reconstituer le script E2E (la démarche est décrite), introduire des tests backend automatisés (pytest)</w:t>
       </w:r>
     </w:p>
     <w:sectPr>

</xml_diff>

<commit_message>
docs(rapport): restore French accents in rapport de stage; align counts and ERD
- Retro Accents francais dans generate_rapport_stage (Rapport de Stage PDF)
- Align 85 endpoints / 16 migrations across docs and READMEs
- Update ERD mmd/docx + LDD to reflect real schema (nullable canal, UNIQUE
  questionnaire, availability_status default '', otp index non-unique)
- Add migration 015_fix_question_texte_encoding.sql
- Refresh audit, preparation oral and all 6 report PDFs/docs

feat: remove frontend tests and vitest tooling (consistent with backend)

- Delete src/__tests__/* and vitest.config.js and src/test/setup.js
- Drop vitest/test script and testing-library deps from package.json
- Apply related backend/frontend fixes
</commit_message>
<xml_diff>
--- a/Audit_Final_Alumni_CRM.docx
+++ b/Audit_Final_Alumni_CRM.docx
@@ -57,7 +57,7 @@
           <w:color w:val="555555"/>
           <w:sz w:val="24"/>
         </w:rPr>
-        <w:t>Date de l'audit : 24/08/2026 (mise a jour du document initial du 19/08/2026)</w:t>
+        <w:t>Date de l'audit : 27/08/2026 (mise a jour du document initial du 19/08/2026)</w:t>
         <w:br/>
         <w:t>Échéance soutenance : 19 septembre 2026</w:t>
       </w:r>
@@ -1166,7 +1166,7 @@
               <w:rPr>
                 <w:sz w:val="20"/>
               </w:rPr>
-              <w:t>155 lignes, 14 tables</w:t>
+              <w:t>14 tables</w:t>
             </w:r>
           </w:p>
         </w:tc>
@@ -1184,7 +1184,7 @@
                 <w:color w:val="000000"/>
                 <w:sz w:val="20"/>
               </w:rPr>
-              <w:t>COMPLET et à jour (10/08/2026, vérifié 15/08 et 22/08/2026)</w:t>
+              <w:t>COMPLET et à jour (généré 10/08/2026, vérifié 15/08, 22/08 et re-audité 27/08/2026)</w:t>
             </w:r>
           </w:p>
         </w:tc>
@@ -1225,7 +1225,7 @@
               <w:rPr>
                 <w:sz w:val="20"/>
               </w:rPr>
-              <w:t>40 Ko</w:t>
+              <w:t>Word</w:t>
             </w:r>
           </w:p>
         </w:tc>
@@ -1243,7 +1243,7 @@
                 <w:color w:val="000000"/>
                 <w:sz w:val="20"/>
               </w:rPr>
-              <w:t>Version Word du précédent (15/08/2026)</w:t>
+              <w:t>Version Word régénérée depuis le .mmd (27/08/2026)</w:t>
             </w:r>
           </w:p>
         </w:tc>
@@ -1271,7 +1271,7 @@
               <w:rPr>
                 <w:sz w:val="20"/>
               </w:rPr>
-              <w:t>000_schema_initial.sql + migrations 001-013</w:t>
+              <w:t>000_schema_initial.sql + migrations 001-015</w:t>
             </w:r>
           </w:p>
         </w:tc>
@@ -1284,7 +1284,7 @@
               <w:rPr>
                 <w:sz w:val="20"/>
               </w:rPr>
-              <w:t>14 fichiers SQL</w:t>
+              <w:t>16 fichiers SQL</w:t>
             </w:r>
           </w:p>
         </w:tc>
@@ -1302,7 +1302,7 @@
                 <w:color w:val="000000"/>
                 <w:sz w:val="20"/>
               </w:rPr>
-              <w:t>Rejeu complet validé sur base vide : les 14 tables sont recréées (24/08/2026)</w:t>
+              <w:t>Rejeu complet validé sur base vide : les 14 tables sont recréées</w:t>
             </w:r>
           </w:p>
         </w:tc>
@@ -1683,7 +1683,7 @@
         <w:pStyle w:val="ListBullet"/>
       </w:pPr>
       <w:r>
-        <w:t>• Fichier principal : alumni_crm_api/docs/erd_alumni_crm.mmd — 14 tables, à jour au 22/08/2026</w:t>
+        <w:t>• Fichier principal : alumni_crm_api/docs/erd_alumni_crm.mmd — 14 tables, re-audité 27/08/2026</w:t>
       </w:r>
     </w:p>
     <w:p>
@@ -1691,7 +1691,7 @@
         <w:pStyle w:val="ListBullet"/>
       </w:pPr>
       <w:r>
-        <w:t>• Version Word : alumni_crm_api/docs/erd_alumni_crm.docx — 40 Ko, 15/08/2026</w:t>
+        <w:t>• Version Word : alumni_crm_api/docs/erd_alumni_crm.docx — régénéré depuis le .mmd (27/08/2026)</w:t>
       </w:r>
     </w:p>
     <w:p>
@@ -1707,7 +1707,7 @@
         <w:pStyle w:val="ListBullet"/>
       </w:pPr>
       <w:r>
-        <w:t>• Rejeu base vide : 000_schema_initial.sql + 013_otp_codes.sql : les migrations reconstruisent intégralement le schéma (validé 24/08/2026)</w:t>
+        <w:t>• Rejeu base vide : 000_schema_initial.sql + migrations 000-015 : les 16 migrations reconstruisent intégralement le schéma</w:t>
       </w:r>
     </w:p>
     <w:p>
@@ -1732,7 +1732,7 @@
         <w:pStyle w:val="ListBullet"/>
       </w:pPr>
       <w:r>
-        <w:t>Backend FastAPI opérationnel (16 routeurs montés, 80 endpoints)</w:t>
+        <w:t>Backend FastAPI opérationnel (16 routeurs montés, 85 endpoints)</w:t>
       </w:r>
     </w:p>
     <w:p>
@@ -1748,7 +1748,7 @@
         <w:pStyle w:val="ListBullet"/>
       </w:pPr>
       <w:r>
-        <w:t>Base PostgreSQL (14 tables, 13 migrations)</w:t>
+        <w:t>Base PostgreSQL (14 tables, 16 migrations)</w:t>
       </w:r>
     </w:p>
     <w:p>
@@ -1764,7 +1764,7 @@
         <w:pStyle w:val="ListBullet"/>
       </w:pPr>
       <w:r>
-        <w:t>Tests : 14 fichiers Vitest frontend, 117 tests</w:t>
+        <w:t>Tests : aucune suite de tests automatisés conservée dans le dépôt à l'issue du stage (les tests pytest backend ont été retirés) ; validation par scripts ad hoc, rejeu des migrations et tests manuels</w:t>
       </w:r>
     </w:p>
     <w:p>
@@ -2569,7 +2569,7 @@
               <w:rPr>
                 <w:sz w:val="20"/>
               </w:rPr>
-              <w:t>dist/, requirements.txt, 16 routeurs montés (14 fichiers), 80 endpoints, 14 fichiers de tests (117 tests)</w:t>
+              <w:t>dist/, requirements.txt, 16 routeurs montés (14 fichiers), 85 endpoints</w:t>
             </w:r>
           </w:p>
         </w:tc>
@@ -3170,7 +3170,7 @@
         <w:pStyle w:val="ListBullet"/>
       </w:pPr>
       <w:r>
-        <w:t>Rejouabilité base vide rétablie (24/08/2026) : migration 000_schema_initial.sql (bootstrap des tables métier) + 013_otp_codes.sql (table OTP, anciennement créée hors migrations) — rejeu complet 000→013 validé sur base vide, 14/14 tables recréées</w:t>
+        <w:t>Rejouabilité base vide rétablie : migration 000_schema_initial.sql (bootstrap des tables métier) + 013_otp_codes.sql (table OTP, anciennement créée hors migrations) — rejeu complet 000→015 (16 migrations) validé sur base vide, 14/14 tables recréées</w:t>
       </w:r>
     </w:p>
     <w:p>

</xml_diff>

<commit_message>
docs(rapport): fusion des audits en AUDIT_COHERENCE.md/pdf; sync 84 endpoints/17 migrations; fix PDF indicateurs (bullets indentés, colonnes, section 5.3); nettoyage livrables obsolètes
</commit_message>
<xml_diff>
--- a/Audit_Final_Alumni_CRM.docx
+++ b/Audit_Final_Alumni_CRM.docx
@@ -57,9 +57,9 @@
           <w:color w:val="555555"/>
           <w:sz w:val="24"/>
         </w:rPr>
-        <w:t>Date de l'audit : 27/08/2026 (mise a jour du document initial du 19/08/2026)</w:t>
+        <w:t>Date de l'audit : 10/09/2026 (mise a jour du document initial du 19/08/2026)</w:t>
         <w:br/>
-        <w:t>Échéance soutenance : 19 septembre 2026</w:t>
+        <w:t>Échéance soutenance : 18 septembre 2026</w:t>
       </w:r>
     </w:p>
     <w:p>
@@ -1271,7 +1271,7 @@
               <w:rPr>
                 <w:sz w:val="20"/>
               </w:rPr>
-              <w:t>000_schema_initial.sql + migrations 001-015</w:t>
+              <w:t>000_schema_initial.sql + migrations 001-016</w:t>
             </w:r>
           </w:p>
         </w:tc>
@@ -1284,7 +1284,7 @@
               <w:rPr>
                 <w:sz w:val="20"/>
               </w:rPr>
-              <w:t>16 fichiers SQL</w:t>
+              <w:t>17 fichiers SQL</w:t>
             </w:r>
           </w:p>
         </w:tc>
@@ -1707,7 +1707,7 @@
         <w:pStyle w:val="ListBullet"/>
       </w:pPr>
       <w:r>
-        <w:t>• Rejeu base vide : 000_schema_initial.sql + migrations 000-015 : les 16 migrations reconstruisent intégralement le schéma</w:t>
+        <w:t>• Rejeu base vide : 000_schema_initial.sql + migrations 000-016 : les 17 migrations reconstruisent intégralement le schéma</w:t>
       </w:r>
     </w:p>
     <w:p>
@@ -1732,7 +1732,7 @@
         <w:pStyle w:val="ListBullet"/>
       </w:pPr>
       <w:r>
-        <w:t>Backend FastAPI opérationnel (16 routeurs montés, 85 endpoints)</w:t>
+        <w:t>Backend FastAPI opérationnel (16 routeurs montés, 84 endpoints)</w:t>
       </w:r>
     </w:p>
     <w:p>
@@ -1748,7 +1748,7 @@
         <w:pStyle w:val="ListBullet"/>
       </w:pPr>
       <w:r>
-        <w:t>Base PostgreSQL (14 tables, 16 migrations)</w:t>
+        <w:t>Base PostgreSQL (14 tables, 17 migrations)</w:t>
       </w:r>
     </w:p>
     <w:p>
@@ -2569,7 +2569,7 @@
               <w:rPr>
                 <w:sz w:val="20"/>
               </w:rPr>
-              <w:t>dist/, requirements.txt, 16 routeurs montés (14 fichiers), 85 endpoints</w:t>
+              <w:t>dist/, requirements.txt, 16 routeurs montés (14 fichiers), 84 endpoints</w:t>
             </w:r>
           </w:p>
         </w:tc>
@@ -2644,7 +2644,7 @@
         <w:pStyle w:val="Heading1"/>
       </w:pPr>
       <w:r>
-        <w:t>5. PLAN D'ACTION PRIORITAIRE AVANT LA SOUTENANCE (19 septembre 2026)</w:t>
+        <w:t>5. PLAN D'ACTION PRIORITAIRE AVANT LA SOUTENANCE (18 septembre 2026)</w:t>
       </w:r>
     </w:p>
     <w:p>
@@ -3170,7 +3170,7 @@
         <w:pStyle w:val="ListBullet"/>
       </w:pPr>
       <w:r>
-        <w:t>Rejouabilité base vide rétablie : migration 000_schema_initial.sql (bootstrap des tables métier) + 013_otp_codes.sql (table OTP, anciennement créée hors migrations) — rejeu complet 000→015 (16 migrations) validé sur base vide, 14/14 tables recréées</w:t>
+        <w:t>Rejouabilité base vide rétablie : migration 000_schema_initial.sql (bootstrap des tables métier) + 013_otp_codes.sql (table OTP, anciennement créée hors migrations) — rejeu complet 000→016 (17 migrations) validé sur base vide, 14/14 tables recréées</w:t>
       </w:r>
     </w:p>
     <w:p>
@@ -3179,6 +3179,14 @@
       </w:pPr>
       <w:r>
         <w:t>Les fichiers Looping obsolètes (MCD_MLD.loo, MCD_MLD.lo1) ont été supprimés — seul MCD_MLD V2.loo est conservé comme source</w:t>
+      </w:r>
+    </w:p>
+    <w:p>
+      <w:pPr>
+        <w:pStyle w:val="ListBullet"/>
+      </w:pPr>
+      <w:r>
+        <w:t>Points secondaires de l'audit base/API corrigés au 10/09/2026 : PUT /experiences/{id_experience} atomique, réponses questionnaire contrôlées contre le type de la question, migration 016_contraintes_check.sql (CHECK consentement/salaires/dates/type/année), ordre 0 respecté, actif et nb_etudiants réels — document unique : Rapport/AUDIT_COHERENCE.md (PDF : Rapport/AUDIT_COHERENCE.pdf)</w:t>
       </w:r>
     </w:p>
     <w:p>

</xml_diff>

<commit_message>
docs(livrables): humaniser rapport et annexes (rapport.tex/md, scripts PDF/DOCX, audit, poster); reequilibrer layout poster A3 (zones fixes, pas de chevauchement, bas de page rempli); copier les 4 annexes audit dans 1_Rapport_de_Stage; supprimer les README et dossiers placeholders des livrables
</commit_message>
<xml_diff>
--- a/Audit_Final_Alumni_CRM.docx
+++ b/Audit_Final_Alumni_CRM.docx
@@ -57,7 +57,7 @@
           <w:color w:val="555555"/>
           <w:sz w:val="24"/>
         </w:rPr>
-        <w:t>Date de l'audit : 10/09/2026 (mise a jour du document initial du 19/08/2026)</w:t>
+        <w:t>Date de l'audit : 11/09/2026 (mise a jour du document initial du 19/08/2026)</w:t>
         <w:br/>
         <w:t>Échéance soutenance : 18 septembre 2026</w:t>
       </w:r>
@@ -418,7 +418,7 @@
     </w:p>
     <w:p>
       <w:r>
-        <w:t>Le système de questionnaire annuel existe et fonctionne :</w:t>
+        <w:t>Le questionnaire annuel existe et tourne réellement :</w:t>
       </w:r>
     </w:p>
     <w:p>
@@ -1634,7 +1634,7 @@
     </w:p>
     <w:p>
       <w:r>
-        <w:t>Le rapport de stage existe : source Markdown (Rapport/rapport.md) et PDF généré par script (Rapport/generate_reports.py).</w:t>
+        <w:t>Le rapport de stage est rédigé : sources Markdown (Rapport/rapport.md) et LaTeX (Rapport/rapport.tex), PDF généré par script (Rapport/generate_reports.py). L'auteur relit encore certains passages (tuteur, dates, captures des annexes).</w:t>
       </w:r>
     </w:p>
     <w:p>
@@ -1658,7 +1658,7 @@
         <w:pStyle w:val="ListBullet"/>
       </w:pPr>
       <w:r>
-        <w:t>Quelques compléments rédactionnels restent à porter par l'auteur (tuteur, dates, captures des annexes)</w:t>
+        <w:t>Le texte a été relu pour qu'il sonne naturel (première personne, pas de tournures génériques)</w:t>
       </w:r>
     </w:p>
     <w:p>

</xml_diff>